<commit_message>
Patient full synthetic notes
</commit_message>
<xml_diff>
--- a/docs/Query Summary and Results.docx
+++ b/docs/Query Summary and Results.docx
@@ -448,16 +448,7 @@
                 <w:sz w:val="28"/>
                 <w:szCs w:val="28"/>
               </w:rPr>
-              <w:t xml:space="preserve"> within 30 days of the prescription, and </w:t>
-            </w:r>
-            <w:r>
-              <w:rPr>
-                <w:rFonts w:ascii="Cambria Math" w:hAnsi="Cambria Math"/>
-                <w:sz w:val="28"/>
-                <w:szCs w:val="28"/>
-              </w:rPr>
-              <w:lastRenderedPageBreak/>
-              <w:t>whose nodes or related clinical data mention 'myalgia' or 'muscle pain'.</w:t>
+              <w:t xml:space="preserve"> within 30 days of the prescription, and whose nodes or related clinical data mention 'myalgia' or 'muscle pain'.</w:t>
             </w:r>
           </w:p>
         </w:tc>
@@ -497,7 +488,6 @@
                 <w:sz w:val="28"/>
                 <w:szCs w:val="28"/>
               </w:rPr>
-              <w:lastRenderedPageBreak/>
               <w:t>Path</w:t>
             </w:r>
             <w:r>
@@ -583,7 +573,6 @@
                 <w:szCs w:val="28"/>
                 <w:lang w:val="en-US"/>
               </w:rPr>
-              <w:lastRenderedPageBreak/>
               <w:t>[IS_DIAGNOSED_WITH]</w:t>
             </w:r>
             <w:r>
@@ -734,17 +723,7 @@
                 <w:szCs w:val="28"/>
                 <w:lang w:val="en-US"/>
               </w:rPr>
-              <w:t>: "myalgia" OR "muscl</w:t>
-            </w:r>
-            <w:r>
-              <w:rPr>
-                <w:rFonts w:ascii="Cambria Math" w:eastAsia="Times New Roman" w:hAnsi="Cambria Math"/>
-                <w:sz w:val="28"/>
-                <w:szCs w:val="28"/>
-                <w:lang w:val="en-US"/>
-              </w:rPr>
-              <w:lastRenderedPageBreak/>
-              <w:t>e pain"]</w:t>
+              <w:t>: "myalgia" OR "muscle pain"]</w:t>
             </w:r>
           </w:p>
         </w:tc>
@@ -783,7 +762,6 @@
                 <w:sz w:val="28"/>
                 <w:szCs w:val="28"/>
               </w:rPr>
-              <w:lastRenderedPageBreak/>
               <w:t>2 patients:</w:t>
             </w:r>
             <w:r>
@@ -821,16 +799,7 @@
                 <w:sz w:val="28"/>
                 <w:szCs w:val="28"/>
               </w:rPr>
-              <w:t xml:space="preserve"> Lisinopril and </w:t>
-            </w:r>
-            <w:r>
-              <w:rPr>
-                <w:rFonts w:ascii="Cambria Math" w:hAnsi="Cambria Math"/>
-                <w:sz w:val="28"/>
-                <w:szCs w:val="28"/>
-              </w:rPr>
-              <w:lastRenderedPageBreak/>
-              <w:t>Atorvastatin (linked by similarity).</w:t>
+              <w:t xml:space="preserve"> Lisinopril and Atorvastatin (linked by similarity).</w:t>
             </w:r>
           </w:p>
           <w:p>
@@ -879,7 +848,6 @@
               <w:rPr>
                 <w:noProof/>
               </w:rPr>
-              <w:lastRenderedPageBreak/>
               <w:drawing>
                 <wp:inline distT="0" distB="0" distL="0" distR="0" wp14:anchorId="6EFF7952" wp14:editId="59DE345A">
                   <wp:extent cx="6057900" cy="3589020"/>
@@ -960,7 +928,6 @@
               <w:rPr>
                 <w:noProof/>
               </w:rPr>
-              <w:lastRenderedPageBreak/>
               <w:drawing>
                 <wp:inline distT="0" distB="0" distL="0" distR="0" wp14:anchorId="3C8B3A63" wp14:editId="444BABB3">
                   <wp:extent cx="6195060" cy="1562100"/>
@@ -1045,7 +1012,6 @@
                 <w:sz w:val="28"/>
                 <w:szCs w:val="28"/>
               </w:rPr>
-              <w:lastRenderedPageBreak/>
               <w:t>"equivalent" works using GDS similarity between drugs</w:t>
             </w:r>
           </w:p>
@@ -1126,7 +1092,6 @@
                 <w:sz w:val="28"/>
                 <w:szCs w:val="28"/>
               </w:rPr>
-              <w:lastRenderedPageBreak/>
               <w:t>2</w:t>
             </w:r>
           </w:p>
@@ -1381,7 +1346,6 @@
                 <w:szCs w:val="28"/>
                 <w:lang w:val="en-US"/>
               </w:rPr>
-              <w:lastRenderedPageBreak/>
               <w:t>[</w:t>
             </w:r>
             <w:proofErr w:type="spellStart"/>
@@ -1552,7 +1516,6 @@
                 <w:sz w:val="28"/>
                 <w:szCs w:val="28"/>
               </w:rPr>
-              <w:lastRenderedPageBreak/>
               <w:t xml:space="preserve">Patient: </w:t>
             </w:r>
             <w:r>
@@ -1678,7 +1641,6 @@
                 <w:szCs w:val="28"/>
                 <w:lang w:val="en-US"/>
               </w:rPr>
-              <w:lastRenderedPageBreak/>
               <w:t> </w:t>
             </w:r>
           </w:p>
@@ -1775,7 +1737,6 @@
                 <w:sz w:val="28"/>
                 <w:szCs w:val="28"/>
               </w:rPr>
-              <w:lastRenderedPageBreak/>
               <w:t xml:space="preserve">drug switch to a clinically equivalent one which is functionally or structurally similar </w:t>
             </w:r>
           </w:p>
@@ -1818,7 +1779,6 @@
                 <w:sz w:val="28"/>
                 <w:szCs w:val="28"/>
               </w:rPr>
-              <w:lastRenderedPageBreak/>
               <w:t>3</w:t>
             </w:r>
           </w:p>
@@ -2126,17 +2086,7 @@
                 <w:szCs w:val="28"/>
                 <w:lang w:val="en-US"/>
               </w:rPr>
-              <w:t>Conditi</w:t>
-            </w:r>
-            <w:r>
-              <w:rPr>
-                <w:rFonts w:ascii="Cambria Math" w:eastAsia="Times New Roman" w:hAnsi="Cambria Math"/>
-                <w:sz w:val="28"/>
-                <w:szCs w:val="28"/>
-                <w:lang w:val="en-US"/>
-              </w:rPr>
-              <w:lastRenderedPageBreak/>
-              <w:t>on (RDM)</w:t>
+              <w:t>Condition (RDM)</w:t>
             </w:r>
           </w:p>
           <w:p>
@@ -2343,17 +2293,7 @@
                 <w:szCs w:val="28"/>
                 <w:lang w:val="en-US"/>
               </w:rPr>
-              <w:t xml:space="preserve"> </w:t>
-            </w:r>
-            <w:r>
-              <w:rPr>
-                <w:rFonts w:ascii="Cambria Math" w:eastAsia="Times New Roman" w:hAnsi="Cambria Math"/>
-                <w:sz w:val="28"/>
-                <w:szCs w:val="28"/>
-                <w:lang w:val="en-US"/>
-              </w:rPr>
-              <w:lastRenderedPageBreak/>
-              <w:t>(Diagnosis)]</w:t>
+              <w:t xml:space="preserve"> (Diagnosis)]</w:t>
             </w:r>
           </w:p>
         </w:tc>
@@ -2392,7 +2332,6 @@
                 <w:sz w:val="28"/>
                 <w:szCs w:val="28"/>
               </w:rPr>
-              <w:lastRenderedPageBreak/>
               <w:t xml:space="preserve">Patient: </w:t>
             </w:r>
             <w:r>
@@ -2559,7 +2498,6 @@
               <w:rPr>
                 <w:noProof/>
               </w:rPr>
-              <w:lastRenderedPageBreak/>
               <w:drawing>
                 <wp:inline distT="0" distB="0" distL="0" distR="0" wp14:anchorId="2C781B15" wp14:editId="16B3D032">
                   <wp:extent cx="8290560" cy="929640"/>
@@ -2644,7 +2582,6 @@
                 <w:sz w:val="28"/>
                 <w:szCs w:val="28"/>
               </w:rPr>
-              <w:lastRenderedPageBreak/>
               <w:t>Shows drug overlap window, currently just native query filter and match</w:t>
             </w:r>
           </w:p>
@@ -2687,7 +2624,6 @@
                 <w:sz w:val="28"/>
                 <w:szCs w:val="28"/>
               </w:rPr>
-              <w:lastRenderedPageBreak/>
               <w:t>4</w:t>
             </w:r>
           </w:p>
@@ -2725,16 +2661,7 @@
                 <w:sz w:val="28"/>
                 <w:szCs w:val="28"/>
               </w:rPr>
-              <w:t xml:space="preserve">Across the entire population, what is the incidence rate of RDM within 30 days of a patient being on a high-risk co-exposure (any ACE Inhibitor + any Statin), and does a history of Hypertension </w:t>
-            </w:r>
-            <w:r>
-              <w:rPr>
-                <w:rFonts w:ascii="Cambria Math" w:hAnsi="Cambria Math"/>
-                <w:sz w:val="28"/>
-                <w:szCs w:val="28"/>
-              </w:rPr>
-              <w:lastRenderedPageBreak/>
-              <w:t xml:space="preserve">significantly accelerate the time-to-injury? </w:t>
+              <w:t xml:space="preserve">Across the entire population, what is the incidence rate of RDM within 30 days of a patient being on a high-risk co-exposure (any ACE Inhibitor + any Statin), and does a history of Hypertension significantly accelerate the time-to-injury? </w:t>
             </w:r>
           </w:p>
           <w:p>
@@ -2795,7 +2722,6 @@
                 <w:sz w:val="28"/>
                 <w:szCs w:val="28"/>
               </w:rPr>
-              <w:lastRenderedPageBreak/>
               <w:t>Path</w:t>
             </w:r>
             <w:r>
@@ -2915,17 +2841,7 @@
                 <w:szCs w:val="28"/>
                 <w:lang w:val="en-US"/>
               </w:rPr>
-              <w:t>Conditi</w:t>
-            </w:r>
-            <w:r>
-              <w:rPr>
-                <w:rFonts w:ascii="Cambria Math" w:eastAsia="Times New Roman" w:hAnsi="Cambria Math"/>
-                <w:sz w:val="28"/>
-                <w:szCs w:val="28"/>
-                <w:lang w:val="en-US"/>
-              </w:rPr>
-              <w:lastRenderedPageBreak/>
-              <w:t>on (RDM)</w:t>
+              <w:t>Condition (RDM)</w:t>
             </w:r>
           </w:p>
           <w:p>
@@ -3132,7 +3048,6 @@
                 <w:sz w:val="28"/>
                 <w:szCs w:val="28"/>
               </w:rPr>
-              <w:lastRenderedPageBreak/>
               <w:t>summary of the drug-drug interaction (DDI) risk</w:t>
             </w:r>
           </w:p>
@@ -3269,7 +3184,6 @@
                 <w:szCs w:val="28"/>
                 <w:lang w:val="en-US"/>
               </w:rPr>
-              <w:lastRenderedPageBreak/>
               <w:t> </w:t>
             </w:r>
           </w:p>
@@ -3366,7 +3280,6 @@
                 <w:sz w:val="28"/>
                 <w:szCs w:val="28"/>
               </w:rPr>
-              <w:lastRenderedPageBreak/>
               <w:t xml:space="preserve">GDS finds patients on drugs equivalent to the </w:t>
             </w:r>
             <w:proofErr w:type="gramStart"/>
@@ -3465,7 +3378,6 @@
                 <w:sz w:val="28"/>
                 <w:szCs w:val="28"/>
               </w:rPr>
-              <w:lastRenderedPageBreak/>
               <w:t>5</w:t>
             </w:r>
           </w:p>
@@ -3688,17 +3600,7 @@
                 <w:szCs w:val="28"/>
                 <w:lang w:val="en-US"/>
               </w:rPr>
-              <w:t>[Jaccar</w:t>
-            </w:r>
-            <w:r>
-              <w:rPr>
-                <w:rFonts w:ascii="Cambria Math" w:eastAsia="Times New Roman" w:hAnsi="Cambria Math"/>
-                <w:sz w:val="28"/>
-                <w:szCs w:val="28"/>
-                <w:lang w:val="en-US"/>
-              </w:rPr>
-              <w:lastRenderedPageBreak/>
-              <w:t>d similarity score]</w:t>
+              <w:t>[Jaccard similarity score]</w:t>
             </w:r>
             <w:r>
               <w:rPr>
@@ -3806,7 +3708,6 @@
                 <w:sz w:val="28"/>
                 <w:szCs w:val="28"/>
               </w:rPr>
-              <w:lastRenderedPageBreak/>
               <w:t>Condition combo + patient match %</w:t>
             </w:r>
           </w:p>
@@ -4019,16 +3920,7 @@
                 <w:sz w:val="28"/>
                 <w:szCs w:val="28"/>
               </w:rPr>
-              <w:t xml:space="preserve">Identify patients who share a clinical profile with known injury cases and are currently exposed </w:t>
-            </w:r>
-            <w:r>
-              <w:rPr>
-                <w:rFonts w:ascii="Cambria Math" w:hAnsi="Cambria Math"/>
-                <w:sz w:val="28"/>
-                <w:szCs w:val="28"/>
-              </w:rPr>
-              <w:lastRenderedPageBreak/>
-              <w:t>to high-risk polypharmacy, but have not yet manifested RDM</w:t>
+              <w:t>Identify patients who share a clinical profile with known injury cases and are currently exposed to high-risk polypharmacy, but have not yet manifested RDM</w:t>
             </w:r>
           </w:p>
           <w:p>
@@ -4089,7 +3981,6 @@
                 <w:sz w:val="28"/>
                 <w:szCs w:val="28"/>
               </w:rPr>
-              <w:lastRenderedPageBreak/>
               <w:t>Path</w:t>
             </w:r>
             <w:r>
@@ -4158,17 +4049,7 @@
                 <w:szCs w:val="28"/>
                 <w:lang w:val="en-US"/>
               </w:rPr>
-              <w:t xml:space="preserve">Patient </w:t>
-            </w:r>
-            <w:r>
-              <w:rPr>
-                <w:rFonts w:ascii="Cambria Math" w:eastAsia="Times New Roman" w:hAnsi="Cambria Math"/>
-                <w:sz w:val="28"/>
-                <w:szCs w:val="28"/>
-                <w:lang w:val="en-US"/>
-              </w:rPr>
-              <w:lastRenderedPageBreak/>
-              <w:t>(Candidate)</w:t>
+              <w:t>Patient (Candidate)</w:t>
             </w:r>
             <w:r>
               <w:rPr>
@@ -4305,17 +4186,7 @@
                 <w:szCs w:val="28"/>
                 <w:lang w:val="en-US"/>
               </w:rPr>
-              <w:t>duration_day</w:t>
-            </w:r>
-            <w:r>
-              <w:rPr>
-                <w:rFonts w:ascii="Cambria Math" w:eastAsia="Times New Roman" w:hAnsi="Cambria Math"/>
-                <w:sz w:val="28"/>
-                <w:szCs w:val="28"/>
-                <w:lang w:val="en-US"/>
-              </w:rPr>
-              <w:lastRenderedPageBreak/>
-              <w:t>s</w:t>
+              <w:t>duration_days</w:t>
             </w:r>
             <w:proofErr w:type="spellEnd"/>
             <w:r>
@@ -4399,7 +4270,6 @@
                 <w:sz w:val="28"/>
                 <w:szCs w:val="28"/>
               </w:rPr>
-              <w:lastRenderedPageBreak/>
               <w:t>Patient + Risk summary % + flag</w:t>
             </w:r>
           </w:p>

</xml_diff>